<commit_message>
Fix raiz: dataBinding + core.xml subject causaban 'PROCEDIMIENTO EN BLANCO' fantasma
</commit_message>
<xml_diff>
--- a/workspaces/instructivos/PCC5_PROCEDIMIENTO_REGISTRO_DE_GASTOS_ANUAL_DE_MOTOCICLETAS_DE_COBRADORES.docx
+++ b/workspaces/instructivos/PCC5_PROCEDIMIENTO_REGISTRO_DE_GASTOS_ANUAL_DE_MOTOCICLETAS_DE_COBRADORES.docx
@@ -204,7 +204,6 @@
             <w:alias w:val="Título"/>
             <w:tag w:val=""/>
             <w:id w:val="1735040861"/>
-            <w:dataBinding w:prefixMappings="xmlns:ns0='http://purl.org/dc/elements/1.1/' xmlns:ns1='http://schemas.openxmlformats.org/package/2006/metadata/core-properties' " w:xpath="/ns1:coreProperties[1]/ns0:title[1]" w:storeItemID="{6C3C8BC8-F283-45AE-878A-BAB7291924A1}"/>
             <w:text/>
           </w:sdtPr>
           <w:sdtEndPr>
@@ -436,7 +435,6 @@
             <w:alias w:val="Subtítulo"/>
             <w:tag w:val=""/>
             <w:id w:val="328029620"/>
-            <w:dataBinding w:prefixMappings="xmlns:ns0='http://purl.org/dc/elements/1.1/' xmlns:ns1='http://schemas.openxmlformats.org/package/2006/metadata/core-properties' " w:xpath="/ns1:coreProperties[1]/ns0:subject[1]" w:storeItemID="{6C3C8BC8-F283-45AE-878A-BAB7291924A1}"/>
             <w:text/>
           </w:sdtPr>
           <w:sdtEndPr/>
@@ -1200,10 +1198,6 @@
             <w:alias w:val="Subtítulo"/>
             <w:tag w:val=""/>
             <w:id w:val="-107509445"/>
-            <w:placeholder>
-              <w:docPart w:val="6C5A3788A4AF420BA2F43B819F2C81E0"/>
-            </w:placeholder>
-            <w:dataBinding w:prefixMappings="xmlns:ns0='http://purl.org/dc/elements/1.1/' xmlns:ns1='http://schemas.openxmlformats.org/package/2006/metadata/core-properties' " w:xpath="/ns1:coreProperties[1]/ns0:subject[1]" w:storeItemID="{6C3C8BC8-F283-45AE-878A-BAB7291924A1}"/>
             <w:text/>
           </w:sdtPr>
           <w:sdtEndPr/>

</xml_diff>

<commit_message>
Fix CLAVE en header2: inserta en misma celda, no en vMerge + regenera PCE6/PCC5/PCC6
</commit_message>
<xml_diff>
--- a/workspaces/instructivos/PCC5_PROCEDIMIENTO_REGISTRO_DE_GASTOS_ANUAL_DE_MOTOCICLETAS_DE_COBRADORES.docx
+++ b/workspaces/instructivos/PCC5_PROCEDIMIENTO_REGISTRO_DE_GASTOS_ANUAL_DE_MOTOCICLETAS_DE_COBRADORES.docx
@@ -1286,7 +1286,7 @@
               <w:b/>
               <w:bCs/>
             </w:rPr>
-            <w:t xml:space="preserve">CLAVE: </w:t>
+            <w:t xml:space="preserve">CLAVE: PCC5</w:t>
           </w:r>
         </w:p>
       </w:tc>
@@ -1311,15 +1311,6 @@
             <w:pStyle w:val="Encabezado"/>
             <w:jc w:val="center"/>
           </w:pPr>
-          <w:r>
-            <w:rPr>
-              <w:b/>
-              <w:bCs/>
-              <w:sz w:val="24"/>
-              <w:szCs w:val="24"/>
-            </w:rPr>
-            <w:t>PCC5</w:t>
-          </w:r>
         </w:p>
       </w:tc>
       <w:tc>

</xml_diff>